<commit_message>
Update LinkedIn description and resume bullets for agentic RAG (v1.3.0)
</commit_message>
<xml_diff>
--- a/docs/Resume_Bullets.docx
+++ b/docs/Resume_Bullets.docx
@@ -55,7 +55,15 @@
         <w:pStyle w:val="ListBullet"/>
       </w:pPr>
       <w:r>
-        <w:t>Added in-browser document upload with server-side validation and path-traversal protection, plus a 24-test pytest suite and GitHub Actions CI that runs fully offline.</w:t>
+        <w:t>Designed an agentic mode that routes each query (answer/search/clarify), uses the LLM to self-evaluate retrieval quality, and rephrases-and-retries the search before answering, surfacing its reasoning steps to the user.</w:t>
+      </w:r>
+    </w:p>
+    <w:p>
+      <w:pPr>
+        <w:pStyle w:val="ListBullet"/>
+      </w:pPr>
+      <w:r>
+        <w:t>Added in-browser document upload with server-side validation and path-traversal protection, plus a 48-test pytest suite (81% coverage) and GitHub Actions CI that runs fully offline.</w:t>
       </w:r>
     </w:p>
     <w:p>
@@ -79,7 +87,7 @@
         <w:pStyle w:val="ListBullet"/>
       </w:pPr>
       <w:r>
-        <w:t>Delivered multi-format ingestion (PDF/DOCX/MD/TXT), streaming responses, secure in-browser upload, and a 24-test suite with GitHub Actions CI.</w:t>
+        <w:t>Built an agentic mode (query routing, LLM-based retrieval self-evaluation, and rephrase-and-retry), multi-format ingestion (PDF/DOCX/MD/TXT), streaming responses, secure in-browser upload, and a 48-test suite (81% coverage) with GitHub Actions CI.</w:t>
       </w:r>
     </w:p>
     <w:p>
@@ -95,7 +103,7 @@
         <w:pStyle w:val="ListBullet"/>
       </w:pPr>
       <w:r>
-        <w:t>Built a local-first RAG document-Q&amp;A app (FastAPI + Ollama, Azure-ready) with streaming responses, cited sources, multi-format ingestion, and CI-tested APIs.</w:t>
+        <w:t>Built a local-first, agentic RAG document-Q&amp;A app (FastAPI + Ollama, Azure-ready) with query routing, retrieval self-evaluation, streaming responses, cited sources, multi-format ingestion, and CI-tested APIs.</w:t>
       </w:r>
     </w:p>
     <w:sectPr>

</xml_diff>